<commit_message>
fix: CaratulaA.docx - ajuste de layout para una sola página en LibreOffice
Co-Authored-By: Claude Sonnet 4.6 <noreply@anthropic.com>
</commit_message>
<xml_diff>
--- a/back/templates/CaratulaA.docx
+++ b/back/templates/CaratulaA.docx
@@ -43,12 +43,12 @@
           <wp:inline distB="0" distT="0" distL="0" distR="0">
             <wp:extent cx="4862533" cy="1535536"/>
             <wp:effectExtent b="0" l="0" r="0" t="0"/>
-            <wp:docPr id="219" name="image1.png"/>
+            <wp:docPr id="219" name="image2.png"/>
             <a:graphic>
               <a:graphicData uri="http://schemas.openxmlformats.org/drawingml/2006/picture">
                 <pic:pic>
                   <pic:nvPicPr>
-                    <pic:cNvPr id="0" name="image1.png"/>
+                    <pic:cNvPr id="0" name="image2.png"/>
                     <pic:cNvPicPr preferRelativeResize="0"/>
                   </pic:nvPicPr>
                   <pic:blipFill>
@@ -116,12 +116,12 @@
           <wp:inline distB="0" distT="0" distL="0" distR="0">
             <wp:extent cx="2505369" cy="2486599"/>
             <wp:effectExtent b="0" l="0" r="0" t="0"/>
-            <wp:docPr id="220" name="image2.png"/>
+            <wp:docPr id="220" name="image1.png"/>
             <a:graphic>
               <a:graphicData uri="http://schemas.openxmlformats.org/drawingml/2006/picture">
                 <pic:pic>
                   <pic:nvPicPr>
-                    <pic:cNvPr id="0" name="image2.png"/>
+                    <pic:cNvPr id="0" name="image1.png"/>
                     <pic:cNvPicPr preferRelativeResize="0"/>
                   </pic:nvPicPr>
                   <pic:blipFill>
@@ -170,10 +170,7 @@
           <w:tab w:val="left" w:leader="none" w:pos="2655"/>
         </w:tabs>
         <w:jc w:val="center"/>
-        <w:rPr>
-          <w:sz w:val="40"/>
-          <w:szCs w:val="40"/>
-        </w:rPr>
+        <w:rPr/>
       </w:pPr>
       <w:bookmarkStart w:colFirst="0" w:colLast="0" w:name="_heading=h.5cg1i2ekvfl5" w:id="0"/>
       <w:bookmarkEnd w:id="0"/>
@@ -183,31 +180,8 @@
           <w:szCs w:val="40"/>
           <w:rtl w:val="0"/>
         </w:rPr>
-        <w:t xml:space="preserve">Paciente: {nombre}</w:t>
-      </w:r>
-    </w:p>
-    <w:p>
-      <w:pPr>
-        <w:tabs>
-          <w:tab w:val="left" w:leader="none" w:pos="2655"/>
-        </w:tabs>
-        <w:jc w:val="center"/>
-        <w:rPr/>
-      </w:pPr>
-      <w:r>
-        <w:rPr>
-          <w:rtl w:val="0"/>
-        </w:rPr>
-      </w:r>
-    </w:p>
-    <w:p>
-      <w:pPr>
-        <w:tabs>
-          <w:tab w:val="left" w:leader="none" w:pos="2655"/>
-        </w:tabs>
-        <w:jc w:val="center"/>
-        <w:rPr/>
-      </w:pPr>
+        <w:t xml:space="preserve">PACIENTE: {nombre}</w:t>
+      </w:r>
       <w:r>
         <w:rPr>
           <w:rtl w:val="0"/>
@@ -225,7 +199,7 @@
                 <wp:positionV relativeFrom="paragraph">
                   <wp:posOffset>722112</wp:posOffset>
                 </wp:positionV>
-                <wp:extent cx="2781300" cy="1414145"/>
+                <wp:extent cx="2781300" cy="1414381"/>
                 <wp:effectExtent b="0" l="0" r="0" t="0"/>
                 <wp:wrapSquare wrapText="bothSides" distB="45720" distT="45720" distL="114300" distR="114300"/>
                 <wp:docPr id="218" name=""/>
@@ -333,7 +307,33 @@
                                 <w:sz w:val="28"/>
                                 <w:vertAlign w:val="baseline"/>
                               </w:rPr>
-                              <w:t xml:space="preserve">MN 174112     MP 235697</w:t>
+                              <w:t xml:space="preserve">MN 174112</w:t>
+                            </w:r>
+                            <w:r>
+                              <w:rPr>
+                                <w:rFonts w:ascii="Times New Roman" w:cs="Times New Roman" w:eastAsia="Times New Roman" w:hAnsi="Times New Roman"/>
+                                <w:b w:val="1"/>
+                                <w:i w:val="0"/>
+                                <w:smallCaps w:val="0"/>
+                                <w:strike w:val="0"/>
+                                <w:color w:val="003f3e"/>
+                                <w:sz w:val="28"/>
+                                <w:vertAlign w:val="baseline"/>
+                              </w:rPr>
+                              <w:t xml:space="preserve"> </w:t>
+                            </w:r>
+                            <w:r>
+                              <w:rPr>
+                                <w:rFonts w:ascii="Times New Roman" w:cs="Times New Roman" w:eastAsia="Times New Roman" w:hAnsi="Times New Roman"/>
+                                <w:b w:val="1"/>
+                                <w:i w:val="0"/>
+                                <w:smallCaps w:val="0"/>
+                                <w:strike w:val="0"/>
+                                <w:color w:val="003f3e"/>
+                                <w:sz w:val="28"/>
+                                <w:vertAlign w:val="baseline"/>
+                              </w:rPr>
+                              <w:t xml:space="preserve">MP 235697</w:t>
                             </w:r>
                           </w:p>
                         </w:txbxContent>
@@ -357,7 +357,7 @@
                 <wp:positionV relativeFrom="paragraph">
                   <wp:posOffset>722112</wp:posOffset>
                 </wp:positionV>
-                <wp:extent cx="2781300" cy="1414145"/>
+                <wp:extent cx="2781300" cy="1414381"/>
                 <wp:effectExtent b="0" l="0" r="0" t="0"/>
                 <wp:wrapSquare wrapText="bothSides" distB="45720" distT="45720" distL="114300" distR="114300"/>
                 <wp:docPr id="218" name="image3.png"/>
@@ -378,7 +378,7 @@
                       <pic:spPr>
                         <a:xfrm>
                           <a:off x="0" y="0"/>
-                          <a:ext cx="2781300" cy="1414145"/>
+                          <a:ext cx="2781300" cy="1414381"/>
                         </a:xfrm>
                         <a:prstGeom prst="rect"/>
                         <a:ln/>

</xml_diff>

<commit_message>
fix: CaratulaA y CaratulaC - ajuste de layout para una sola página
Co-Authored-By: Claude Sonnet 4.6 <noreply@anthropic.com>
</commit_message>
<xml_diff>
--- a/back/templates/CaratulaA.docx
+++ b/back/templates/CaratulaA.docx
@@ -43,12 +43,12 @@
           <wp:inline distB="0" distT="0" distL="0" distR="0">
             <wp:extent cx="4862533" cy="1535536"/>
             <wp:effectExtent b="0" l="0" r="0" t="0"/>
-            <wp:docPr id="219" name="image2.png"/>
+            <wp:docPr id="219" name="image1.png"/>
             <a:graphic>
               <a:graphicData uri="http://schemas.openxmlformats.org/drawingml/2006/picture">
                 <pic:pic>
                   <pic:nvPicPr>
-                    <pic:cNvPr id="0" name="image2.png"/>
+                    <pic:cNvPr id="0" name="image1.png"/>
                     <pic:cNvPicPr preferRelativeResize="0"/>
                   </pic:nvPicPr>
                   <pic:blipFill>
@@ -116,12 +116,12 @@
           <wp:inline distB="0" distT="0" distL="0" distR="0">
             <wp:extent cx="2505369" cy="2486599"/>
             <wp:effectExtent b="0" l="0" r="0" t="0"/>
-            <wp:docPr id="220" name="image1.png"/>
+            <wp:docPr id="220" name="image2.png"/>
             <a:graphic>
               <a:graphicData uri="http://schemas.openxmlformats.org/drawingml/2006/picture">
                 <pic:pic>
                   <pic:nvPicPr>
-                    <pic:cNvPr id="0" name="image1.png"/>
+                    <pic:cNvPr id="0" name="image2.png"/>
                     <pic:cNvPicPr preferRelativeResize="0"/>
                   </pic:nvPicPr>
                   <pic:blipFill>
@@ -170,12 +170,19 @@
           <w:tab w:val="left" w:leader="none" w:pos="2655"/>
         </w:tabs>
         <w:jc w:val="center"/>
-        <w:rPr/>
+        <w:rPr>
+          <w:b w:val="1"/>
+          <w:bCs w:val="1"/>
+          <w:color w:val="265c4e"/>
+        </w:rPr>
       </w:pPr>
       <w:bookmarkStart w:colFirst="0" w:colLast="0" w:name="_heading=h.5cg1i2ekvfl5" w:id="0"/>
       <w:bookmarkEnd w:id="0"/>
       <w:r>
         <w:rPr>
+          <w:b w:val="1"/>
+          <w:bCs w:val="1"/>
+          <w:color w:val="265c4e"/>
           <w:sz w:val="40"/>
           <w:szCs w:val="40"/>
           <w:rtl w:val="0"/>
@@ -197,7 +204,7 @@
                   <wp:posOffset>1415415</wp:posOffset>
                 </wp:positionH>
                 <wp:positionV relativeFrom="paragraph">
-                  <wp:posOffset>722112</wp:posOffset>
+                  <wp:posOffset>960120</wp:posOffset>
                 </wp:positionV>
                 <wp:extent cx="2781300" cy="1414381"/>
                 <wp:effectExtent b="0" l="0" r="0" t="0"/>
@@ -355,7 +362,7 @@
                   <wp:posOffset>1415415</wp:posOffset>
                 </wp:positionH>
                 <wp:positionV relativeFrom="paragraph">
-                  <wp:posOffset>722112</wp:posOffset>
+                  <wp:posOffset>960120</wp:posOffset>
                 </wp:positionV>
                 <wp:extent cx="2781300" cy="1414381"/>
                 <wp:effectExtent b="0" l="0" r="0" t="0"/>

</xml_diff>

<commit_message>
fix: CaratulaA.docx - ajuste de layout
Co-Authored-By: Claude Sonnet 4.6 <noreply@anthropic.com>
</commit_message>
<xml_diff>
--- a/back/templates/CaratulaA.docx
+++ b/back/templates/CaratulaA.docx
@@ -43,7 +43,7 @@
           <wp:inline distB="0" distT="0" distL="0" distR="0">
             <wp:extent cx="4862533" cy="1535536"/>
             <wp:effectExtent b="0" l="0" r="0" t="0"/>
-            <wp:docPr id="219" name="image1.png"/>
+            <wp:docPr id="220" name="image1.png"/>
             <a:graphic>
               <a:graphicData uri="http://schemas.openxmlformats.org/drawingml/2006/picture">
                 <pic:pic>
@@ -116,12 +116,12 @@
           <wp:inline distB="0" distT="0" distL="0" distR="0">
             <wp:extent cx="2505369" cy="2486599"/>
             <wp:effectExtent b="0" l="0" r="0" t="0"/>
-            <wp:docPr id="220" name="image2.png"/>
+            <wp:docPr id="221" name="image3.png"/>
             <a:graphic>
               <a:graphicData uri="http://schemas.openxmlformats.org/drawingml/2006/picture">
                 <pic:pic>
                   <pic:nvPicPr>
-                    <pic:cNvPr id="0" name="image2.png"/>
+                    <pic:cNvPr id="0" name="image3.png"/>
                     <pic:cNvPicPr preferRelativeResize="0"/>
                   </pic:nvPicPr>
                   <pic:blipFill>
@@ -174,6 +174,8 @@
           <w:b w:val="1"/>
           <w:bCs w:val="1"/>
           <w:color w:val="265c4e"/>
+          <w:sz w:val="40"/>
+          <w:szCs w:val="40"/>
         </w:rPr>
       </w:pPr>
       <w:bookmarkStart w:colFirst="0" w:colLast="0" w:name="_heading=h.5cg1i2ekvfl5" w:id="0"/>
@@ -190,9 +192,46 @@
         <w:t xml:space="preserve">PACIENTE: {nombre}</w:t>
       </w:r>
       <w:r>
-        <w:rPr>
-          <w:rtl w:val="0"/>
-        </w:rPr>
+        <w:drawing>
+          <wp:anchor allowOverlap="1" behindDoc="1" distB="114300" distT="114300" distL="114300" distR="114300" hidden="0" layoutInCell="1" locked="0" relativeHeight="0" simplePos="0">
+            <wp:simplePos x="0" y="0"/>
+            <wp:positionH relativeFrom="column">
+              <wp:posOffset>2076450</wp:posOffset>
+            </wp:positionH>
+            <wp:positionV relativeFrom="paragraph">
+              <wp:posOffset>304800</wp:posOffset>
+            </wp:positionV>
+            <wp:extent cx="1467802" cy="804924"/>
+            <wp:effectExtent b="0" l="0" r="0" t="0"/>
+            <wp:wrapNone/>
+            <wp:docPr id="219" name="image2.png"/>
+            <a:graphic>
+              <a:graphicData uri="http://schemas.openxmlformats.org/drawingml/2006/picture">
+                <pic:pic>
+                  <pic:nvPicPr>
+                    <pic:cNvPr id="0" name="image2.png"/>
+                    <pic:cNvPicPr preferRelativeResize="0"/>
+                  </pic:nvPicPr>
+                  <pic:blipFill>
+                    <a:blip r:embed="rId9"/>
+                    <a:srcRect b="0" l="0" r="0" t="0"/>
+                    <a:stretch>
+                      <a:fillRect/>
+                    </a:stretch>
+                  </pic:blipFill>
+                  <pic:spPr>
+                    <a:xfrm>
+                      <a:off x="0" y="0"/>
+                      <a:ext cx="1467802" cy="804924"/>
+                    </a:xfrm>
+                    <a:prstGeom prst="rect"/>
+                    <a:ln/>
+                  </pic:spPr>
+                </pic:pic>
+              </a:graphicData>
+            </a:graphic>
+          </wp:anchor>
+        </w:drawing>
       </w:r>
       <w:r>
         <mc:AlternateContent>
@@ -367,16 +406,16 @@
                 <wp:extent cx="2781300" cy="1414381"/>
                 <wp:effectExtent b="0" l="0" r="0" t="0"/>
                 <wp:wrapSquare wrapText="bothSides" distB="45720" distT="45720" distL="114300" distR="114300"/>
-                <wp:docPr id="218" name="image3.png"/>
+                <wp:docPr id="218" name="image4.png"/>
                 <a:graphic>
                   <a:graphicData uri="http://schemas.openxmlformats.org/drawingml/2006/picture">
                     <pic:pic>
                       <pic:nvPicPr>
-                        <pic:cNvPr id="0" name="image3.png"/>
+                        <pic:cNvPr id="0" name="image4.png"/>
                         <pic:cNvPicPr preferRelativeResize="0"/>
                       </pic:nvPicPr>
                       <pic:blipFill>
-                        <a:blip r:embed="rId9"/>
+                        <a:blip r:embed="rId10"/>
                         <a:srcRect/>
                         <a:stretch>
                           <a:fillRect/>
@@ -399,8 +438,30 @@
         </mc:AlternateContent>
       </w:r>
     </w:p>
+    <w:p>
+      <w:pPr>
+        <w:tabs>
+          <w:tab w:val="left" w:leader="none" w:pos="2655"/>
+        </w:tabs>
+        <w:jc w:val="center"/>
+        <w:rPr>
+          <w:b w:val="1"/>
+          <w:bCs w:val="1"/>
+          <w:color w:val="265c4e"/>
+          <w:sz w:val="40"/>
+          <w:szCs w:val="40"/>
+        </w:rPr>
+      </w:pPr>
+      <w:bookmarkStart w:colFirst="0" w:colLast="0" w:name="_heading=h.rie1rn6h5stc" w:id="1"/>
+      <w:bookmarkEnd w:id="1"/>
+      <w:r>
+        <w:rPr>
+          <w:rtl w:val="0"/>
+        </w:rPr>
+      </w:r>
+    </w:p>
     <w:sectPr>
-      <w:headerReference r:id="rId10" w:type="default"/>
+      <w:headerReference r:id="rId11" w:type="default"/>
       <w:pgSz w:h="15840" w:w="12240" w:orient="portrait"/>
       <w:pgMar w:bottom="1417" w:top="1417" w:left="1701" w:right="1701" w:header="708" w:footer="708"/>
       <w:pgNumType w:start="1"/>
@@ -967,7 +1028,7 @@
 
 <file path=customXML/item1.xml><?xml version="1.0" encoding="utf-8"?>
 <go:gDocsCustomXmlDataStorage xmlns:go="http://customooxmlschemas.google.com/" xmlns:r="http://schemas.openxmlformats.org/officeDocument/2006/relationships" uri="GoogleDocsCustomDataVersion2">
-  <go:docsCustomData xmlns:go="http://customooxmlschemas.google.com/" roundtripDataSignature="AMtx7miy2gujrZ8XRWy76X8eOL2uFGIjHg==">CgMxLjAyDmguNWNnMWkyZWt2Zmw1OAByITEwUVFrdzRZLVMyaV9BeGNCMWVHNVFKeWp2SDdaYThKRw==</go:docsCustomData>
+  <go:docsCustomData xmlns:go="http://customooxmlschemas.google.com/" roundtripDataSignature="AMtx7mhxAqENudefMDVHTgWOstWdb0GleQ==">CgMxLjAyDmguNWNnMWkyZWt2Zmw1Mg5oLnJpZTFybjZoNXN0YzgAciExMFFRa3c0WS1TMmlfQXhjQjFlRzVRSnlqdkg3WmE4Skc=</go:docsCustomData>
 </go:gDocsCustomXmlDataStorage>
 </file>
 

</xml_diff>